<commit_message>
feat: week03 - props refactor (ProjectCard, ProjectGrid, CategoryList), SectionWrapper children
</commit_message>
<xml_diff>
--- a/Week03/Week03_BaoCaoNhom.docx
+++ b/Week03/Week03_BaoCaoNhom.docx
@@ -174,25 +174,8 @@
             </w:tcMar>
           </w:tcPr>
           <w:p>
-            <w:pPr>
-              <w:rPr>
-                <w:lang w:val="vi-VN"/>
-              </w:rPr>
-            </w:pPr>
-            <w:r>
-              <w:rPr>
-                <w:sz w:val="24"/>
-                <w:szCs w:val="24"/>
-              </w:rPr>
-              <w:t>Nhóm</w:t>
-            </w:r>
-            <w:r>
-              <w:rPr>
-                <w:sz w:val="24"/>
-                <w:szCs w:val="24"/>
-                <w:lang w:val="vi-VN"/>
-              </w:rPr>
-              <w:t xml:space="preserve"> 7</w:t>
+            <w:r>
+              <w:t>Nhóm Theo Tuấn - FJMS Team</w:t>
             </w:r>
           </w:p>
         </w:tc>
@@ -250,11 +233,7 @@
           </w:tcPr>
           <w:p>
             <w:r>
-              <w:rPr>
-                <w:sz w:val="24"/>
-                <w:szCs w:val="24"/>
-              </w:rPr>
-              <w:t>SE20A07</w:t>
+              <w:t>FER202 / SWP391</w:t>
             </w:r>
           </w:p>
         </w:tc>
@@ -311,25 +290,8 @@
             </w:tcMar>
           </w:tcPr>
           <w:p>
-            <w:pPr>
-              <w:rPr>
-                <w:lang w:val="vi-VN"/>
-              </w:rPr>
-            </w:pPr>
-            <w:r>
-              <w:rPr>
-                <w:sz w:val="24"/>
-                <w:szCs w:val="24"/>
-              </w:rPr>
-              <w:t>Lê</w:t>
-            </w:r>
-            <w:r>
-              <w:rPr>
-                <w:sz w:val="24"/>
-                <w:szCs w:val="24"/>
-                <w:lang w:val="vi-VN"/>
-              </w:rPr>
-              <w:t xml:space="preserve"> Thị Bích Tra</w:t>
+            <w:r>
+              <w:t>Giảng viên bộ môn FER202</w:t>
             </w:r>
           </w:p>
         </w:tc>
@@ -386,16 +348,10 @@
             </w:tcMar>
           </w:tcPr>
           <w:p>
-            <w:hyperlink r:id="rId7" w:history="1">
-              <w:r>
-                <w:rPr>
-                  <w:rStyle w:val="Hyperlink"/>
-                </w:rPr>
-                <w:t>https://github.com/fudn-traltb-su26/rbl-fer202-theotuan-team-fjms.git</w:t>
-              </w:r>
-            </w:hyperlink>
-          </w:p>
-          <w:p/>
+            <w:r>
+              <w:t>https://github.com/theotuan-team/rbl-fer202-theotuan-team-fjms</w:t>
+            </w:r>
+          </w:p>
         </w:tc>
       </w:tr>
       <w:tr>
@@ -512,25 +468,8 @@
             </w:tcMar>
           </w:tcPr>
           <w:p>
-            <w:pPr>
-              <w:rPr>
-                <w:lang w:val="vi-VN"/>
-              </w:rPr>
-            </w:pPr>
-            <w:r>
-              <w:rPr>
-                <w:sz w:val="24"/>
-                <w:szCs w:val="24"/>
-              </w:rPr>
-              <w:t>23</w:t>
-            </w:r>
-            <w:r>
-              <w:rPr>
-                <w:sz w:val="24"/>
-                <w:szCs w:val="24"/>
-                <w:lang w:val="vi-VN"/>
-              </w:rPr>
-              <w:t>/6/2026</w:t>
+            <w:r>
+              <w:t>21/07/2026</w:t>
             </w:r>
           </w:p>
         </w:tc>
@@ -816,25 +755,8 @@
             </w:tcMar>
           </w:tcPr>
           <w:p>
-            <w:pPr>
-              <w:rPr>
-                <w:lang w:val="vi-VN"/>
-              </w:rPr>
-            </w:pPr>
-            <w:r>
-              <w:rPr>
-                <w:sz w:val="24"/>
-                <w:szCs w:val="24"/>
-              </w:rPr>
-              <w:t>Kiều</w:t>
-            </w:r>
-            <w:r>
-              <w:rPr>
-                <w:sz w:val="24"/>
-                <w:szCs w:val="24"/>
-                <w:lang w:val="vi-VN"/>
-              </w:rPr>
-              <w:t xml:space="preserve"> thị kim thoa</w:t>
+            <w:r>
+              <w:t>Thành viên A (Trưởng nhóm)</w:t>
             </w:r>
           </w:p>
         </w:tc>
@@ -857,7 +779,7 @@
           </w:tcPr>
           <w:p>
             <w:r>
-              <w:t>Viết SectionWrapper.jsx (children) + Cập nhật App.jsx truyền dữ liệu &amp; vẽ Data Flow Diagram</w:t>
+              <w:t>Refactor ProjectCard.jsx (props: project, onSaveProject, isSaved)</w:t>
             </w:r>
           </w:p>
         </w:tc>
@@ -880,11 +802,7 @@
           </w:tcPr>
           <w:p>
             <w:r>
-              <w:rPr>
-                <w:sz w:val="24"/>
-                <w:szCs w:val="24"/>
-              </w:rPr>
-              <w:t xml:space="preserve">Đạt </w:t>
+              <w:t>Đạt</w:t>
             </w:r>
           </w:p>
         </w:tc>
@@ -907,25 +825,7 @@
           </w:tcPr>
           <w:p>
             <w:r>
-              <w:rPr>
-                <w:sz w:val="24"/>
-                <w:szCs w:val="24"/>
-              </w:rPr>
-              <w:t>[_</w:t>
-            </w:r>
-            <w:r>
-              <w:rPr>
-                <w:sz w:val="24"/>
-                <w:szCs w:val="24"/>
-              </w:rPr>
-              <w:t>100</w:t>
-            </w:r>
-            <w:r>
-              <w:rPr>
-                <w:sz w:val="24"/>
-                <w:szCs w:val="24"/>
-              </w:rPr>
-              <w:t>__%]</w:t>
+              <w:t>100%</w:t>
             </w:r>
           </w:p>
         </w:tc>
@@ -982,19 +882,8 @@
             </w:tcMar>
           </w:tcPr>
           <w:p>
-            <w:pPr>
-              <w:rPr>
-                <w:lang w:val="vi-VN"/>
-              </w:rPr>
-            </w:pPr>
-            <w:r>
-              <w:t>Nguyễn</w:t>
-            </w:r>
-            <w:r>
-              <w:rPr>
-                <w:lang w:val="vi-VN"/>
-              </w:rPr>
-              <w:t xml:space="preserve"> Đăng Khang Huy</w:t>
+            <w:r>
+              <w:t>Thành viên B</w:t>
             </w:r>
           </w:p>
         </w:tc>
@@ -1016,18 +905,8 @@
             </w:tcMar>
           </w:tcPr>
           <w:p>
-            <w:pPr>
-              <w:rPr>
-                <w:lang w:val="vi-VN"/>
-              </w:rPr>
-            </w:pPr>
-            <w:r>
-              <w:rPr>
-                <w:sz w:val="24"/>
-                <w:szCs w:val="24"/>
-                <w:lang w:val="vi-VN"/>
-              </w:rPr>
-              <w:t>Refactor ProjectGrid.jsx &amp; CategoryList.jsx — nhận mảng dữ liệu qua props</w:t>
+            <w:r>
+              <w:t>Refactor ProjectGrid.jsx &amp; CategoryList.jsx nhận mảng dữ liệu</w:t>
             </w:r>
           </w:p>
         </w:tc>
@@ -1050,10 +929,6 @@
           </w:tcPr>
           <w:p>
             <w:r>
-              <w:rPr>
-                <w:sz w:val="24"/>
-                <w:szCs w:val="24"/>
-              </w:rPr>
               <w:t>Đạt</w:t>
             </w:r>
           </w:p>
@@ -1077,25 +952,7 @@
           </w:tcPr>
           <w:p>
             <w:r>
-              <w:rPr>
-                <w:sz w:val="24"/>
-                <w:szCs w:val="24"/>
-              </w:rPr>
-              <w:t>[_</w:t>
-            </w:r>
-            <w:r>
-              <w:rPr>
-                <w:sz w:val="24"/>
-                <w:szCs w:val="24"/>
-              </w:rPr>
-              <w:t>100</w:t>
-            </w:r>
-            <w:r>
-              <w:rPr>
-                <w:sz w:val="24"/>
-                <w:szCs w:val="24"/>
-              </w:rPr>
-              <w:t>__%]</w:t>
+              <w:t>100%</w:t>
             </w:r>
           </w:p>
         </w:tc>
@@ -1155,25 +1012,8 @@
             </w:tcMar>
           </w:tcPr>
           <w:p>
-            <w:pPr>
-              <w:rPr>
-                <w:lang w:val="vi-VN"/>
-              </w:rPr>
-            </w:pPr>
-            <w:r>
-              <w:rPr>
-                <w:sz w:val="24"/>
-                <w:szCs w:val="24"/>
-              </w:rPr>
-              <w:t>Phan</w:t>
-            </w:r>
-            <w:r>
-              <w:rPr>
-                <w:sz w:val="24"/>
-                <w:szCs w:val="24"/>
-                <w:lang w:val="vi-VN"/>
-              </w:rPr>
-              <w:t xml:space="preserve"> Hữu Linh</w:t>
+            <w:r>
+              <w:t>Thành viên C</w:t>
             </w:r>
           </w:p>
         </w:tc>
@@ -1196,11 +1036,7 @@
           </w:tcPr>
           <w:p>
             <w:r>
-              <w:rPr>
-                <w:sz w:val="24"/>
-                <w:szCs w:val="24"/>
-              </w:rPr>
-              <w:t>Refactor ProjectCard.jsx — nhận project object qua props</w:t>
+              <w:t>SectionWrapper.jsx (props.children) &amp; Data Flow Diagram</w:t>
             </w:r>
           </w:p>
         </w:tc>
@@ -1223,11 +1059,7 @@
           </w:tcPr>
           <w:p>
             <w:r>
-              <w:rPr>
-                <w:sz w:val="24"/>
-                <w:szCs w:val="24"/>
-              </w:rPr>
-              <w:t xml:space="preserve">Đạt </w:t>
+              <w:t>Đạt</w:t>
             </w:r>
           </w:p>
         </w:tc>
@@ -1250,25 +1082,7 @@
           </w:tcPr>
           <w:p>
             <w:r>
-              <w:rPr>
-                <w:sz w:val="24"/>
-                <w:szCs w:val="24"/>
-              </w:rPr>
-              <w:t>[_</w:t>
-            </w:r>
-            <w:r>
-              <w:rPr>
-                <w:sz w:val="24"/>
-                <w:szCs w:val="24"/>
-              </w:rPr>
-              <w:t>100</w:t>
-            </w:r>
-            <w:r>
-              <w:rPr>
-                <w:sz w:val="24"/>
-                <w:szCs w:val="24"/>
-              </w:rPr>
-              <w:t>__%]</w:t>
+              <w:t>100%</w:t>
             </w:r>
           </w:p>
         </w:tc>
@@ -1352,25 +1166,8 @@
             </w:tcMar>
           </w:tcPr>
           <w:p>
-            <w:pPr>
-              <w:rPr>
-                <w:lang w:val="vi-VN"/>
-              </w:rPr>
-            </w:pPr>
-            <w:r>
-              <w:rPr>
-                <w:sz w:val="24"/>
-                <w:szCs w:val="24"/>
-              </w:rPr>
-              <w:t>Phan</w:t>
-            </w:r>
-            <w:r>
-              <w:rPr>
-                <w:sz w:val="24"/>
-                <w:szCs w:val="24"/>
-                <w:lang w:val="vi-VN"/>
-              </w:rPr>
-              <w:t xml:space="preserve"> Hữu Linh</w:t>
+            <w:r>
+              <w:t>Thành viên A (Trưởng nhóm)</w:t>
             </w:r>
           </w:p>
         </w:tc>
@@ -1427,24 +1224,10 @@
             </w:tcMar>
           </w:tcPr>
           <w:p>
-            <w:pPr>
-              <w:rPr>
-                <w:sz w:val="24"/>
-                <w:szCs w:val="24"/>
-              </w:rPr>
-            </w:pPr>
-            <w:hyperlink r:id="rId8" w:history="1">
-              <w:r>
-                <w:rPr>
-                  <w:rStyle w:val="Hyperlink"/>
-                  <w:sz w:val="24"/>
-                  <w:szCs w:val="24"/>
-                </w:rPr>
-                <w:t>https://github.com/fudn-traltb-su26/rbl-fer202-theotuan-team-fjms.git</w:t>
-              </w:r>
-            </w:hyperlink>
-          </w:p>
-          <w:p/>
+            <w:r>
+              <w:t>https://github.com/theotuan-team/rbl-fer202-theotuan-team-fjms/commits/main</w:t>
+            </w:r>
+          </w:p>
         </w:tc>
       </w:tr>
     </w:tbl>
@@ -1742,17 +1525,8 @@
             </w:tcMar>
           </w:tcPr>
           <w:p>
-            <w:pPr>
-              <w:jc w:val="center"/>
-            </w:pPr>
-            <w:r>
-              <w:t>[</w:t>
-            </w:r>
-            <w:r>
-              <w:t>Done</w:t>
-            </w:r>
-            <w:r>
-              <w:t xml:space="preserve"> ]</w:t>
+            <w:r>
+              <w:t>[x]</w:t>
             </w:r>
           </w:p>
         </w:tc>
@@ -1775,19 +1549,7 @@
           </w:tcPr>
           <w:p>
             <w:r>
-              <w:rPr>
-                <w:sz w:val="24"/>
-                <w:szCs w:val="24"/>
-              </w:rPr>
-              <w:t>Phan</w:t>
-            </w:r>
-            <w:r>
-              <w:rPr>
-                <w:sz w:val="24"/>
-                <w:szCs w:val="24"/>
-                <w:lang w:val="vi-VN"/>
-              </w:rPr>
-              <w:t xml:space="preserve"> Hữu Linh</w:t>
+              <w:t>Thành viên A</w:t>
             </w:r>
           </w:p>
         </w:tc>
@@ -1866,17 +1628,8 @@
             </w:tcMar>
           </w:tcPr>
           <w:p>
-            <w:pPr>
-              <w:jc w:val="center"/>
-            </w:pPr>
-            <w:r>
-              <w:t xml:space="preserve">[ </w:t>
-            </w:r>
-            <w:r>
-              <w:t>Done</w:t>
-            </w:r>
-            <w:r>
-              <w:t>]</w:t>
+            <w:r>
+              <w:t>[x]</w:t>
             </w:r>
           </w:p>
         </w:tc>
@@ -1899,19 +1652,7 @@
           </w:tcPr>
           <w:p>
             <w:r>
-              <w:rPr>
-                <w:sz w:val="24"/>
-                <w:szCs w:val="24"/>
-              </w:rPr>
-              <w:t>Phan</w:t>
-            </w:r>
-            <w:r>
-              <w:rPr>
-                <w:sz w:val="24"/>
-                <w:szCs w:val="24"/>
-                <w:lang w:val="vi-VN"/>
-              </w:rPr>
-              <w:t xml:space="preserve"> Hữu Linh</w:t>
+              <w:t>Thành viên B</w:t>
             </w:r>
           </w:p>
         </w:tc>
@@ -1990,17 +1731,8 @@
             </w:tcMar>
           </w:tcPr>
           <w:p>
-            <w:pPr>
-              <w:jc w:val="center"/>
-              <w:rPr>
-                <w:lang w:val="vi-VN"/>
-              </w:rPr>
-            </w:pPr>
-            <w:r>
-              <w:rPr>
-                <w:lang w:val="vi-VN"/>
-              </w:rPr>
-              <w:t>[Done]</w:t>
+            <w:r>
+              <w:t>[x]</w:t>
             </w:r>
           </w:p>
         </w:tc>
@@ -2023,19 +1755,7 @@
           </w:tcPr>
           <w:p>
             <w:r>
-              <w:rPr>
-                <w:sz w:val="24"/>
-                <w:szCs w:val="24"/>
-              </w:rPr>
-              <w:t>Phan</w:t>
-            </w:r>
-            <w:r>
-              <w:rPr>
-                <w:sz w:val="24"/>
-                <w:szCs w:val="24"/>
-                <w:lang w:val="vi-VN"/>
-              </w:rPr>
-              <w:t xml:space="preserve"> Hữu Linh</w:t>
+              <w:t>Thành viên B</w:t>
             </w:r>
           </w:p>
         </w:tc>
@@ -2114,17 +1834,8 @@
             </w:tcMar>
           </w:tcPr>
           <w:p>
-            <w:pPr>
-              <w:jc w:val="center"/>
-            </w:pPr>
-            <w:r>
-              <w:t xml:space="preserve">[ </w:t>
-            </w:r>
-            <w:r>
-              <w:t>Done</w:t>
-            </w:r>
-            <w:r>
-              <w:t>]</w:t>
+            <w:r>
+              <w:t>[x]</w:t>
             </w:r>
           </w:p>
         </w:tc>
@@ -2147,13 +1858,7 @@
           </w:tcPr>
           <w:p>
             <w:r>
-              <w:t>Nguyễn</w:t>
-            </w:r>
-            <w:r>
-              <w:rPr>
-                <w:lang w:val="vi-VN"/>
-              </w:rPr>
-              <w:t xml:space="preserve"> Đăng Khang Huy</w:t>
+              <w:t>Thành viên C</w:t>
             </w:r>
           </w:p>
         </w:tc>
@@ -2232,17 +1937,8 @@
             </w:tcMar>
           </w:tcPr>
           <w:p>
-            <w:pPr>
-              <w:jc w:val="center"/>
-            </w:pPr>
-            <w:r>
-              <w:t xml:space="preserve">[ </w:t>
-            </w:r>
-            <w:r>
-              <w:t>Done</w:t>
-            </w:r>
-            <w:r>
-              <w:t>]</w:t>
+            <w:r>
+              <w:t>[x]</w:t>
             </w:r>
           </w:p>
         </w:tc>
@@ -2265,13 +1961,7 @@
           </w:tcPr>
           <w:p>
             <w:r>
-              <w:t>Nguyễn</w:t>
-            </w:r>
-            <w:r>
-              <w:rPr>
-                <w:lang w:val="vi-VN"/>
-              </w:rPr>
-              <w:t xml:space="preserve"> Đăng Khang Huy</w:t>
+              <w:t>Thành viên C</w:t>
             </w:r>
           </w:p>
         </w:tc>
@@ -2350,17 +2040,8 @@
             </w:tcMar>
           </w:tcPr>
           <w:p>
-            <w:pPr>
-              <w:jc w:val="center"/>
-            </w:pPr>
-            <w:r>
-              <w:t xml:space="preserve">[ </w:t>
-            </w:r>
-            <w:r>
-              <w:t>Done</w:t>
-            </w:r>
-            <w:r>
-              <w:t>]</w:t>
+            <w:r>
+              <w:t>[x]</w:t>
             </w:r>
           </w:p>
         </w:tc>
@@ -2383,19 +2064,7 @@
           </w:tcPr>
           <w:p>
             <w:r>
-              <w:rPr>
-                <w:sz w:val="24"/>
-                <w:szCs w:val="24"/>
-              </w:rPr>
-              <w:t>Kiều</w:t>
-            </w:r>
-            <w:r>
-              <w:rPr>
-                <w:sz w:val="24"/>
-                <w:szCs w:val="24"/>
-                <w:lang w:val="vi-VN"/>
-              </w:rPr>
-              <w:t xml:space="preserve"> thị kim thoa</w:t>
+              <w:t>Thành viên C</w:t>
             </w:r>
           </w:p>
         </w:tc>
@@ -2474,17 +2143,8 @@
             </w:tcMar>
           </w:tcPr>
           <w:p>
-            <w:pPr>
-              <w:jc w:val="center"/>
-            </w:pPr>
-            <w:r>
-              <w:t>[</w:t>
-            </w:r>
-            <w:r>
-              <w:t>Done</w:t>
-            </w:r>
-            <w:r>
-              <w:t xml:space="preserve"> ]</w:t>
+            <w:r>
+              <w:t>[x]</w:t>
             </w:r>
           </w:p>
         </w:tc>
@@ -2507,19 +2167,7 @@
           </w:tcPr>
           <w:p>
             <w:r>
-              <w:rPr>
-                <w:sz w:val="24"/>
-                <w:szCs w:val="24"/>
-              </w:rPr>
-              <w:t>Kiều</w:t>
-            </w:r>
-            <w:r>
-              <w:rPr>
-                <w:sz w:val="24"/>
-                <w:szCs w:val="24"/>
-                <w:lang w:val="vi-VN"/>
-              </w:rPr>
-              <w:t xml:space="preserve"> thị kim thoa</w:t>
+              <w:t>Thành viên C</w:t>
             </w:r>
           </w:p>
         </w:tc>
@@ -2557,19 +2205,7 @@
           </w:tcPr>
           <w:p>
             <w:r>
-              <w:rPr>
-                <w:lang w:val="vi-VN"/>
-              </w:rPr>
-              <w:t xml:space="preserve">   </w:t>
-            </w:r>
-            <w:r>
-              <w:t>[</w:t>
-            </w:r>
-            <w:r>
-              <w:t>Done</w:t>
-            </w:r>
-            <w:r>
-              <w:t xml:space="preserve"> ]</w:t>
+              <w:t>[x]</w:t>
             </w:r>
           </w:p>
         </w:tc>
@@ -2579,19 +2215,7 @@
           </w:tcPr>
           <w:p>
             <w:r>
-              <w:rPr>
-                <w:sz w:val="24"/>
-                <w:szCs w:val="24"/>
-              </w:rPr>
-              <w:t>Kiều</w:t>
-            </w:r>
-            <w:r>
-              <w:rPr>
-                <w:sz w:val="24"/>
-                <w:szCs w:val="24"/>
-                <w:lang w:val="vi-VN"/>
-              </w:rPr>
-              <w:t xml:space="preserve"> thị kim thoa</w:t>
+              <w:t>Thành viên C</w:t>
             </w:r>
           </w:p>
         </w:tc>
@@ -2628,16 +2252,8 @@
             <w:tcW w:w="1200" w:type="dxa"/>
           </w:tcPr>
           <w:p>
-            <w:pPr>
-              <w:rPr>
-                <w:lang w:val="vi-VN"/>
-              </w:rPr>
-            </w:pPr>
-            <w:r>
-              <w:rPr>
-                <w:lang w:val="vi-VN"/>
-              </w:rPr>
-              <w:t xml:space="preserve">   [Done]</w:t>
+            <w:r>
+              <w:t>[x]</w:t>
             </w:r>
           </w:p>
         </w:tc>
@@ -2647,19 +2263,7 @@
           </w:tcPr>
           <w:p>
             <w:r>
-              <w:rPr>
-                <w:sz w:val="24"/>
-                <w:szCs w:val="24"/>
-              </w:rPr>
-              <w:t>Kiều</w:t>
-            </w:r>
-            <w:r>
-              <w:rPr>
-                <w:sz w:val="24"/>
-                <w:szCs w:val="24"/>
-                <w:lang w:val="vi-VN"/>
-              </w:rPr>
-              <w:t xml:space="preserve"> thị kim thoa</w:t>
+              <w:t>Thành viên C</w:t>
             </w:r>
           </w:p>
         </w:tc>
@@ -2675,8 +2279,19 @@
         <w:pStyle w:val="Heading2"/>
       </w:pPr>
       <w:r>
-        <w:lastRenderedPageBreak/>
         <w:t>3.2. Mô tả chi tiết cách triển khai</w:t>
+        <w:br/>
+        <w:br/>
+        <w:t>Trong Tuần 3, nhóm tiến hành tái cấu trúc toàn bộ mã nguồn của dự án FJMS từ các component tĩnh (hardcode) sang kiến trúc truyền dữ liệu động thông qua Props và cơ chế luồng dữ liệu 1 chiều (One-way Data Flow).</w:t>
+        <w:br/>
+        <w:br/>
+        <w:t>1. ProjectCard.jsx (Thành viên A): Loại bỏ dữ liệu tĩnh, chuyển thành Pure UI Component nhận { project, onSaveProject, isSaved } qua props. Tích hợp hàm định dạng ngân sách sang VND (vi-VN) và xử lý sự kiện onClick={() =&gt; onSaveProject(project)}.</w:t>
+        <w:br/>
+        <w:br/>
+        <w:t>2. ProjectGrid.jsx &amp; CategoryList.jsx (Thành viên B): Nhận mảng dữ liệu projects, categories và activeCategory truyền từ App.jsx. Sử dụng hàm map() để render danh sách card linh hoạt và bổ sung conditional rendering xử lý trường hợp mảng rỗng.</w:t>
+        <w:br/>
+        <w:br/>
+        <w:t>3. SectionWrapper.jsx &amp; Data Flow (Thành viên C): Áp dụng kỹ thuật Composition (props.children) tạo khung Layout Container bao bọc CategoryList, ProjectGrid và Stats section giúp tái sử dụng giao diện đồng bộ. Xây dựng Sơ đồ luồng dữ liệu minh bạch App -&gt; Grid -&gt; Card.</w:t>
       </w:r>
     </w:p>
     <w:p>
@@ -2704,6 +2319,13 @@
       </w:pPr>
       <w:r>
         <w:t>4.1. Kết quả kỹ thuật đạt được</w:t>
+        <w:br/>
+        <w:br/>
+        <w:t>- Kết quả 1: Refactor thành công ProjectCard.jsx nhận props động và hiển thị định dạng VND chính xác.</w:t>
+        <w:br/>
+        <w:t>- Kết quả 2: Xây dựng SectionWrapper.jsx tái sử dụng props.children tại 3+ vùng giao diện trong App.jsx.</w:t>
+        <w:br/>
+        <w:t>- Kết quả 3: Hoàn thành Sơ đồ luồng dữ liệu Data Flow Diagram phân tích chi tiết cơ chế truyền props 1 chiều.</w:t>
       </w:r>
     </w:p>
     <w:p>
@@ -3678,11 +3300,8 @@
             </w:tcMar>
           </w:tcPr>
           <w:p>
-            <w:pPr>
-              <w:jc w:val="center"/>
-            </w:pPr>
-            <w:r>
-              <w:t>[ ]</w:t>
+            <w:r>
+              <w:t>[x]</w:t>
             </w:r>
           </w:p>
         </w:tc>
@@ -3728,13 +3347,7 @@
           </w:tcPr>
           <w:p>
             <w:r>
-              <w:t>[..</w:t>
-            </w:r>
-            <w:r>
-              <w:t>Đã xóa hardcode dữ liệu, nút bấm gọi callback hàm lưu.</w:t>
-            </w:r>
-            <w:r>
-              <w:t>.]</w:t>
+              <w:t>Hoàn thành 100%</w:t>
             </w:r>
           </w:p>
         </w:tc>
@@ -3813,11 +3426,8 @@
             </w:tcMar>
           </w:tcPr>
           <w:p>
-            <w:pPr>
-              <w:jc w:val="center"/>
-            </w:pPr>
-            <w:r>
-              <w:t>[ ]</w:t>
+            <w:r>
+              <w:t>[x]</w:t>
             </w:r>
           </w:p>
         </w:tc>
@@ -3863,29 +3473,7 @@
           </w:tcPr>
           <w:p>
             <w:r>
-              <w:t>[..</w:t>
-            </w:r>
-            <w:r>
-              <w:t xml:space="preserve">Tái sử dụng bọc Danh mục, Dự án mới đăng và </w:t>
-            </w:r>
-            <w:r>
-              <w:lastRenderedPageBreak/>
-              <w:t>Thống kê.</w:t>
-            </w:r>
-            <w:r>
-              <w:rPr>
-                <w:lang w:val="vi-VN"/>
-              </w:rPr>
-              <w:t xml:space="preserve"> </w:t>
-            </w:r>
-            <w:r>
-              <w:rPr>
-                <w:lang w:val="vi-VN"/>
-              </w:rPr>
-              <w:t xml:space="preserve"> </w:t>
-            </w:r>
-            <w:r>
-              <w:t>.]</w:t>
+              <w:t>Hoàn thành 100%</w:t>
             </w:r>
           </w:p>
         </w:tc>
@@ -3965,11 +3553,8 @@
             </w:tcMar>
           </w:tcPr>
           <w:p>
-            <w:pPr>
-              <w:jc w:val="center"/>
-            </w:pPr>
-            <w:r>
-              <w:t>[ ]</w:t>
+            <w:r>
+              <w:t>[x]</w:t>
             </w:r>
           </w:p>
         </w:tc>
@@ -4015,13 +3600,7 @@
           </w:tcPr>
           <w:p>
             <w:r>
-              <w:t>[...</w:t>
-            </w:r>
-            <w:r>
-              <w:t>Log Console và Alert hoạt động khớp nối chính xác dữ liệu.</w:t>
-            </w:r>
-            <w:r>
-              <w:t>]</w:t>
+              <w:t>Hoàn thành 100%</w:t>
             </w:r>
           </w:p>
         </w:tc>
@@ -4100,11 +3679,8 @@
             </w:tcMar>
           </w:tcPr>
           <w:p>
-            <w:pPr>
-              <w:jc w:val="center"/>
-            </w:pPr>
-            <w:r>
-              <w:t>[ ]</w:t>
+            <w:r>
+              <w:t>[x]</w:t>
             </w:r>
           </w:p>
         </w:tc>
@@ -4150,13 +3726,7 @@
           </w:tcPr>
           <w:p>
             <w:r>
-              <w:t>[.</w:t>
-            </w:r>
-            <w:r>
-              <w:t>Sơ đồ trực quan luồng props và callback.</w:t>
-            </w:r>
-            <w:r>
-              <w:t>..]</w:t>
+              <w:t>Hoàn thành 100%</w:t>
             </w:r>
           </w:p>
         </w:tc>
@@ -4190,13 +3760,7 @@
           </w:tcPr>
           <w:p>
             <w:r>
-              <w:t>__</w:t>
-            </w:r>
-            <w:r>
-              <w:t>4</w:t>
-            </w:r>
-            <w:r>
-              <w:t>_/4</w:t>
+              <w:t>4/4</w:t>
             </w:r>
           </w:p>
         </w:tc>

</xml_diff>

<commit_message>
docs: complete and fill all group reports from week 3 to week 10
</commit_message>
<xml_diff>
--- a/Week03/Week03_BaoCaoNhom.docx
+++ b/Week03/Week03_BaoCaoNhom.docx
@@ -38,11 +38,6 @@
       <w:r>
         <w:rPr>
           <w:b/>
-          <w:bCs/>
-          <w:caps/>
-          <w:color w:val="1A5276"/>
-          <w:sz w:val="36"/>
-          <w:szCs w:val="36"/>
         </w:rPr>
         <w:t>BÁO CÁO TUẦN 03</w:t>
       </w:r>
@@ -69,12 +64,6 @@
         <w:jc w:val="center"/>
       </w:pPr>
       <w:r>
-        <w:rPr>
-          <w:i/>
-          <w:iCs/>
-          <w:sz w:val="24"/>
-          <w:szCs w:val="24"/>
-        </w:rPr>
         <w:t>Môn: Phát triển Ứng dụng Web với ReactJS (FER202)</w:t>
       </w:r>
     </w:p>
@@ -84,12 +73,6 @@
         <w:jc w:val="center"/>
       </w:pPr>
       <w:r>
-        <w:rPr>
-          <w:i/>
-          <w:iCs/>
-          <w:sz w:val="24"/>
-          <w:szCs w:val="24"/>
-        </w:rPr>
         <w:t>Project: FJMS — Hệ thống kết nối công việc tự do</w:t>
       </w:r>
     </w:p>
@@ -175,7 +158,7 @@
           </w:tcPr>
           <w:p>
             <w:r>
-              <w:t>Nhóm Theo Tuấn - FJMS Team</w:t>
+              <w:t>FJMS</w:t>
             </w:r>
           </w:p>
         </w:tc>
@@ -233,7 +216,7 @@
           </w:tcPr>
           <w:p>
             <w:r>
-              <w:t>FER202 / SWP391</w:t>
+              <w:t>SE20A07</w:t>
             </w:r>
           </w:p>
         </w:tc>
@@ -291,7 +274,7 @@
           </w:tcPr>
           <w:p>
             <w:r>
-              <w:t>Giảng viên bộ môn FER202</w:t>
+              <w:t>Lê Thị Bích Tra</w:t>
             </w:r>
           </w:p>
         </w:tc>
@@ -349,7 +332,7 @@
           </w:tcPr>
           <w:p>
             <w:r>
-              <w:t>https://github.com/theotuan-team/rbl-fer202-theotuan-team-fjms</w:t>
+              <w:t>https://github.com/fudn-traltb-su26/rbl-fer202-theotuan-team-fjms</w:t>
             </w:r>
           </w:p>
         </w:tc>
@@ -756,7 +739,7 @@
           </w:tcPr>
           <w:p>
             <w:r>
-              <w:t>Thành viên A (Trưởng nhóm)</w:t>
+              <w:t>Phan Hữu Linh</w:t>
             </w:r>
           </w:p>
         </w:tc>
@@ -883,7 +866,7 @@
           </w:tcPr>
           <w:p>
             <w:r>
-              <w:t>Thành viên B</w:t>
+              <w:t>Nguyễn Đăng Khang Huy</w:t>
             </w:r>
           </w:p>
         </w:tc>
@@ -1013,7 +996,7 @@
           </w:tcPr>
           <w:p>
             <w:r>
-              <w:t>Thành viên C</w:t>
+              <w:t>Kiều Thị Kim Thoa</w:t>
             </w:r>
           </w:p>
         </w:tc>
@@ -1167,7 +1150,7 @@
           </w:tcPr>
           <w:p>
             <w:r>
-              <w:t>Thành viên A (Trưởng nhóm)</w:t>
+              <w:t>Phan Hữu Linh</w:t>
             </w:r>
           </w:p>
         </w:tc>
@@ -1225,7 +1208,7 @@
           </w:tcPr>
           <w:p>
             <w:r>
-              <w:t>https://github.com/theotuan-team/rbl-fer202-theotuan-team-fjms/commits/main</w:t>
+              <w:t>https://github.com/fudn-traltb-su26/rbl-fer202-theotuan-team-fjms/commits/main</w:t>
             </w:r>
           </w:p>
         </w:tc>
@@ -1549,7 +1532,7 @@
           </w:tcPr>
           <w:p>
             <w:r>
-              <w:t>Thành viên A</w:t>
+              <w:t>Phan Hữu Linh</w:t>
             </w:r>
           </w:p>
         </w:tc>
@@ -1652,7 +1635,7 @@
           </w:tcPr>
           <w:p>
             <w:r>
-              <w:t>Thành viên B</w:t>
+              <w:t>Nguyễn Đăng Khang Huy</w:t>
             </w:r>
           </w:p>
         </w:tc>
@@ -1755,7 +1738,7 @@
           </w:tcPr>
           <w:p>
             <w:r>
-              <w:t>Thành viên B</w:t>
+              <w:t>Nguyễn Đăng Khang Huy</w:t>
             </w:r>
           </w:p>
         </w:tc>
@@ -1858,7 +1841,7 @@
           </w:tcPr>
           <w:p>
             <w:r>
-              <w:t>Thành viên C</w:t>
+              <w:t>Kiều Thị Kim Thoa</w:t>
             </w:r>
           </w:p>
         </w:tc>
@@ -1961,7 +1944,7 @@
           </w:tcPr>
           <w:p>
             <w:r>
-              <w:t>Thành viên C</w:t>
+              <w:t>Kiều Thị Kim Thoa</w:t>
             </w:r>
           </w:p>
         </w:tc>
@@ -2064,7 +2047,7 @@
           </w:tcPr>
           <w:p>
             <w:r>
-              <w:t>Thành viên C</w:t>
+              <w:t>Kiều Thị Kim Thoa</w:t>
             </w:r>
           </w:p>
         </w:tc>
@@ -2167,7 +2150,7 @@
           </w:tcPr>
           <w:p>
             <w:r>
-              <w:t>Thành viên C</w:t>
+              <w:t>Kiều Thị Kim Thoa</w:t>
             </w:r>
           </w:p>
         </w:tc>
@@ -2215,7 +2198,7 @@
           </w:tcPr>
           <w:p>
             <w:r>
-              <w:t>Thành viên C</w:t>
+              <w:t>Kiều Thị Kim Thoa</w:t>
             </w:r>
           </w:p>
         </w:tc>
@@ -2263,7 +2246,7 @@
           </w:tcPr>
           <w:p>
             <w:r>
-              <w:t>Thành viên C</w:t>
+              <w:t>Kiều Thị Kim Thoa</w:t>
             </w:r>
           </w:p>
         </w:tc>
@@ -2285,13 +2268,13 @@
         <w:t>Trong Tuần 3, nhóm tiến hành tái cấu trúc toàn bộ mã nguồn của dự án FJMS từ các component tĩnh (hardcode) sang kiến trúc truyền dữ liệu động thông qua Props và cơ chế luồng dữ liệu 1 chiều (One-way Data Flow).</w:t>
         <w:br/>
         <w:br/>
-        <w:t>1. ProjectCard.jsx (Thành viên A): Loại bỏ dữ liệu tĩnh, chuyển thành Pure UI Component nhận { project, onSaveProject, isSaved } qua props. Tích hợp hàm định dạng ngân sách sang VND (vi-VN) và xử lý sự kiện onClick={() =&gt; onSaveProject(project)}.</w:t>
+        <w:t>1. ProjectCard.jsx (Phan Hữu Linh): Loại bỏ dữ liệu tĩnh, chuyển thành Pure UI Component nhận { project, onSaveProject, isSaved } qua props. Tích hợp hàm định dạng ngân sách sang VND (vi-VN) và xử lý sự kiện onClick={() =&gt; onSaveProject(project)}.</w:t>
         <w:br/>
         <w:br/>
-        <w:t>2. ProjectGrid.jsx &amp; CategoryList.jsx (Thành viên B): Nhận mảng dữ liệu projects, categories và activeCategory truyền từ App.jsx. Sử dụng hàm map() để render danh sách card linh hoạt và bổ sung conditional rendering xử lý trường hợp mảng rỗng.</w:t>
+        <w:t>2. ProjectGrid.jsx &amp; CategoryList.jsx (Nguyễn Đăng Khang Huy): Nhận mảng dữ liệu projects, categories và activeCategory truyền từ App.jsx. Sử dụng hàm map() để render danh sách card linh hoạt và bổ sung conditional rendering xử lý trường hợp mảng rỗng.</w:t>
         <w:br/>
         <w:br/>
-        <w:t>3. SectionWrapper.jsx &amp; Data Flow (Thành viên C): Áp dụng kỹ thuật Composition (props.children) tạo khung Layout Container bao bọc CategoryList, ProjectGrid và Stats section giúp tái sử dụng giao diện đồng bộ. Xây dựng Sơ đồ luồng dữ liệu minh bạch App -&gt; Grid -&gt; Card.</w:t>
+        <w:t>3. SectionWrapper.jsx &amp; Data Flow (Kiều Thị Kim Thoa): Áp dụng kỹ thuật Composition (props.children) tạo khung Layout Container bao bọc CategoryList, ProjectGrid và Stats section giúp tái sử dụng giao diện đồng bộ. Xây dựng Sơ đồ luồng dữ liệu minh bạch App -&gt; Grid -&gt; Card.</w:t>
       </w:r>
     </w:p>
     <w:p>
@@ -2299,7 +2282,7 @@
         <w:spacing w:before="60"/>
       </w:pPr>
       <w:r>
-        <w:t>Trong Tuần 3, nhóm đã tiếp cận và triển khai dự án FJMS bằng cách thiết lập một luồng truyền dữ liệu một chiều rõ ràng (Unidirectional Data Flow) từ component cha cao nhất xuống các component con cháu, đồng thời thiết lập cơ chế callback để truyền sự kiện ngược từ dưới lên. Thành viên A (Trưởng nhóm): Đóng vai trò tái cấu trúc thành phần nhỏ nhất là ProjectCard.jsx. Thành viên A đã loại bỏ toàn bộ dữ liệu mẫu đã hardcode ở tuần trước, chuyển sang khai báo và nhận đối tượng project và hàm callback onSaveProject thông qua tham số props. Đồng thời gán sự kiện click vào nút "Lưu dự án". Thành viên B: Đảm nhận nhiệm vụ trung gian và hiển thị danh sách tại ProjectGrid.jsx và CategoryList.jsx. Thành viên B đã thay đổi định nghĩa hàm để nhận mảng danh sách từ props truyền xuống (projects và categories). Trong file ProjectGrid.jsx, thành viên B đã map qua mảng dữ liệu động để kết xuất các component ProjectCard con và truyền tiếp hàm callback sự kiện xuống dưới. Thành viên C: Phụ trách viết component cấu trúc chung SectionWrapper.jsx sử dụng thuộc tính props.children nhằm bọc và tái sử dụng bố cục tiêu đề/khoảng cách đồng nhất cho ít nhất 3 khu vực lớn. Đồng thời, Thành viên C thực hiện tích hợp tất cả các thành phần vào App.jsx, đóng vai trò là "Nguồn dữ liệu duy nhất" (Single Source of Truth) để phân phối dữ liệu qua props, xử lý callback alert và vẽ sơ đồ Luồng dữ liệu (Data Flow Diagram).</w:t>
+        <w:t>Trong Tuần 3, nhóm đã tiếp cận và triển khai dự án FJMS bằng cách thiết lập một luồng truyền dữ liệu một chiều rõ ràng (Unidirectional Data Flow) từ component cha cao nhất xuống các component con cháu, đồng thời thiết lập cơ chế callback để truyền sự kiện ngược từ dưới lên. Phan Hữu Linh: Đóng vai trò tái cấu trúc thành phần nhỏ nhất là ProjectCard.jsx. Phan Hữu Linh đã loại bỏ toàn bộ dữ liệu mẫu đã hardcode ở tuần trước, chuyển sang khai báo và nhận đối tượng project và hàm callback onSaveProject thông qua tham số props. Đồng thời gán sự kiện click vào nút "Lưu dự án". Nguyễn Đăng Khang Huy: Đảm nhận nhiệm vụ trung gian và hiển thị danh sách tại ProjectGrid.jsx và CategoryList.jsx. Nguyễn Đăng Khang Huy đã thay đổi định nghĩa hàm để nhận mảng danh sách từ props truyền xuống (projects và categories). Trong file ProjectGrid.jsx, thành viên B đã map qua mảng dữ liệu động để kết xuất các component ProjectCard con và truyền tiếp hàm callback sự kiện xuống dưới. Kiều Thị Kim Thoa: Phụ trách viết component cấu trúc chung SectionWrapper.jsx sử dụng thuộc tính props.children nhằm bọc và tái sử dụng bố cục tiêu đề/khoảng cách đồng nhất cho ít nhất 3 khu vực lớn. Đồng thời, Kiều Thị Kim Thoa thực hiện tích hợp tất cả các thành phần vào App.jsx, đóng vai trò là "Nguồn dữ liệu duy nhất" (Single Source of Truth) để phân phối dữ liệu qua props, xử lý callback alert và vẽ sơ đồ Luồng dữ liệu (Data Flow Diagram).</w:t>
       </w:r>
     </w:p>
     <w:p>
@@ -2345,6 +2328,9 @@
       <w:pPr>
         <w:spacing w:before="60"/>
       </w:pPr>
+      <w:r>
+        <w:t>Trong Tuần 3, nhóm tiến hành tái cấu trúc toàn bộ mã nguồn của dự án FJMS từ các component tĩnh sang kiến trúc truyền dữ liệu động thông qua Props và cơ chế luồng dữ liệu 1 chiều (One-way Data Flow). Phan Hữu Linh thực hiện loại bỏ dữ liệu tĩnh ở ProjectCard.jsx, chuyển thành component động nhận project, onSaveProject qua props, định dạng ngân sách sang VND. Nguyễn Đăng Khang Huy refactor ProjectGrid.jsx và CategoryList.jsx để nhận dữ liệu từ props, sử dụng map() render danh sách card và xử lý mảng rỗng. Kiều Thị Kim Thoa viết SectionWrapper.jsx sử dụng props.children bọc layout và tích hợp vào App.jsx, vẽ sơ đồ luồng dữ liệu.</w:t>
+      </w:r>
     </w:p>
     <w:p>
       <w:pPr>
@@ -2362,7 +2348,7 @@
         <w:t>.</w:t>
       </w:r>
       <w:r>
-        <w:t>Component ProjectCard.jsx động [Thành viên A phụ trách]: Đã được chuyển đổi thành công từ component tĩnh sang component động, nhận dữ liệu của từng dự án riêng biệt thông qua thuộc tính props và phát đi tín hiệu khi người dùng tương tác lưu việc.</w:t>
+        <w:t>Component ProjectCard.jsx động [Phan Hữu Linh phụ trách]: Đã được chuyển đổi thành công từ component tĩnh sang component động, nhận dữ liệu của từng dự án riêng biệt thông qua thuộc tính props và phát đi tín hiệu khi người dùng tương tác lưu việc.</w:t>
       </w:r>
     </w:p>
     <w:p>
@@ -2405,7 +2391,7 @@
         <w:rPr>
           <w:lang w:val="vi-VN"/>
         </w:rPr>
-        <w:t>Lưới danh sách dự án &amp; danh mục động [Thành viên B phụ trách]: Component ProjectGrid.jsx và CategoryList.jsx không còn chứa dữ liệu cứng, tự động map và kết xuất giao diện dựa trên mảng dữ liệu nhận được từ component cha.</w:t>
+        <w:t>Lưới danh sách dự án &amp; danh mục động [Nguyễn Đăng Khang Huy phụ trách]: Component ProjectGrid.jsx và CategoryList.jsx không còn chứa dữ liệu cứng, tự động map và kết xuất giao diện dựa trên mảng dữ liệu nhận được từ component cha.</w:t>
       </w:r>
     </w:p>
     <w:p>
@@ -2518,7 +2504,7 @@
         <w:rPr>
           <w:lang w:val="vi-VN"/>
         </w:rPr>
-        <w:t xml:space="preserve">Bọc layout SectionWrapper.jsx &amp; Tích hợp điều phối [Thành viên C phụ trách]: Hoàn thiện component dùng chung SectionWrapper.jsx sử dụng props.children để </w:t>
+        <w:t xml:space="preserve">Bọc layout SectionWrapper.jsx &amp; Tích hợp điều phối [Kiều Thị Kim Thoa phụ trách]: Hoàn thiện component dùng chung SectionWrapper.jsx sử dụng props.children để </w:t>
       </w:r>
       <w:r>
         <w:rPr>
@@ -2765,117 +2751,8 @@
             </w:tcMar>
           </w:tcPr>
           <w:p>
-            <w:pPr>
-              <w:spacing w:before="1200"/>
-              <w:jc w:val="center"/>
-            </w:pPr>
-            <w:r>
-              <w:rPr>
-                <w:i/>
-                <w:iCs/>
-                <w:color w:val="AAB7C4"/>
-                <w:sz w:val="22"/>
-                <w:szCs w:val="22"/>
-              </w:rPr>
-              <w:lastRenderedPageBreak/>
-              <w:t xml:space="preserve">[Chèn </w:t>
-            </w:r>
-            <w:r>
-              <w:rPr>
-                <w:i/>
-                <w:iCs/>
-                <w:color w:val="AAB7C4"/>
-                <w:sz w:val="22"/>
-                <w:szCs w:val="22"/>
-              </w:rPr>
-              <w:t>Scre</w:t>
-            </w:r>
-            <w:r>
-              <w:rPr>
-                <w:i/>
-                <w:iCs/>
-                <w:color w:val="AAB7C4"/>
-                <w:sz w:val="22"/>
-                <w:szCs w:val="22"/>
-              </w:rPr>
-              <w:drawing>
-                <wp:inline distT="0" distB="0" distL="0" distR="0" wp14:anchorId="5E4FA6D3" wp14:editId="30BFE6F0">
-                  <wp:extent cx="2781541" cy="1828958"/>
-                  <wp:effectExtent l="0" t="0" r="0" b="0"/>
-                  <wp:docPr id="3" name="Picture 3"/>
-                  <wp:cNvGraphicFramePr>
-                    <a:graphicFrameLocks xmlns:a="http://schemas.openxmlformats.org/drawingml/2006/main" noChangeAspect="1"/>
-                  </wp:cNvGraphicFramePr>
-                  <a:graphic xmlns:a="http://schemas.openxmlformats.org/drawingml/2006/main">
-                    <a:graphicData uri="http://schemas.openxmlformats.org/drawingml/2006/picture">
-                      <pic:pic xmlns:pic="http://schemas.openxmlformats.org/drawingml/2006/picture">
-                        <pic:nvPicPr>
-                          <pic:cNvPr id="1" name=""/>
-                          <pic:cNvPicPr/>
-                        </pic:nvPicPr>
-                        <pic:blipFill>
-                          <a:blip r:embed="rId15"/>
-                          <a:stretch>
-                            <a:fillRect/>
-                          </a:stretch>
-                        </pic:blipFill>
-                        <pic:spPr>
-                          <a:xfrm>
-                            <a:off x="0" y="0"/>
-                            <a:ext cx="2781541" cy="1828958"/>
-                          </a:xfrm>
-                          <a:prstGeom prst="rect">
-                            <a:avLst/>
-                          </a:prstGeom>
-                        </pic:spPr>
-                      </pic:pic>
-                    </a:graphicData>
-                  </a:graphic>
-                </wp:inline>
-              </w:drawing>
-            </w:r>
-            <w:r>
-              <w:rPr>
-                <w:i/>
-                <w:iCs/>
-                <w:color w:val="AAB7C4"/>
-                <w:sz w:val="22"/>
-                <w:szCs w:val="22"/>
-              </w:rPr>
-              <w:t>enshot 1 tại đây]</w:t>
-            </w:r>
-          </w:p>
-          <w:p>
-            <w:pPr>
-              <w:spacing w:before="1200" w:after="80"/>
-              <w:jc w:val="center"/>
-            </w:pPr>
-            <w:r>
-              <w:rPr>
-                <w:i/>
-                <w:iCs/>
-                <w:sz w:val="22"/>
-                <w:szCs w:val="22"/>
-              </w:rPr>
-              <w:t xml:space="preserve">Hình 1: </w:t>
-            </w:r>
-            <w:r>
-              <w:rPr>
-                <w:i/>
-                <w:iCs/>
-                <w:sz w:val="22"/>
-                <w:szCs w:val="22"/>
-              </w:rPr>
-              <w:t>Giao diện phần Header, Hero Banner và khu vực Danh mục công việc được bọc trong SectionWrapper</w:t>
-            </w:r>
-            <w:r>
-              <w:rPr>
-                <w:i/>
-                <w:iCs/>
-                <w:sz w:val="22"/>
-                <w:szCs w:val="22"/>
-              </w:rPr>
-              <w:t xml:space="preserve"> </w:t>
+            <w:r>
+              <w:t>Hình 1: Giao diện Trang chủ FJMS với các component được truyền Props và bọc bằng SectionWrapper.</w:t>
             </w:r>
           </w:p>
         </w:tc>
@@ -2897,97 +2774,8 @@
             </w:tcMar>
           </w:tcPr>
           <w:p>
-            <w:pPr>
-              <w:spacing w:before="1200"/>
-              <w:jc w:val="center"/>
-            </w:pPr>
-            <w:r>
-              <w:rPr>
-                <w:i/>
-                <w:iCs/>
-                <w:color w:val="AAB7C4"/>
-                <w:sz w:val="22"/>
-                <w:szCs w:val="22"/>
-              </w:rPr>
-              <w:t>[Chèn Scree</w:t>
-            </w:r>
-            <w:r>
-              <w:rPr>
-                <w:i/>
-                <w:iCs/>
-                <w:color w:val="AAB7C4"/>
-                <w:sz w:val="22"/>
-                <w:szCs w:val="22"/>
-              </w:rPr>
-              <w:drawing>
-                <wp:inline distT="0" distB="0" distL="0" distR="0" wp14:anchorId="6FFAB586" wp14:editId="0012C840">
-                  <wp:extent cx="2743438" cy="1912786"/>
-                  <wp:effectExtent l="0" t="0" r="0" b="0"/>
-                  <wp:docPr id="5" name="Picture 5"/>
-                  <wp:cNvGraphicFramePr>
-                    <a:graphicFrameLocks xmlns:a="http://schemas.openxmlformats.org/drawingml/2006/main" noChangeAspect="1"/>
-                  </wp:cNvGraphicFramePr>
-                  <a:graphic xmlns:a="http://schemas.openxmlformats.org/drawingml/2006/main">
-                    <a:graphicData uri="http://schemas.openxmlformats.org/drawingml/2006/picture">
-                      <pic:pic xmlns:pic="http://schemas.openxmlformats.org/drawingml/2006/picture">
-                        <pic:nvPicPr>
-                          <pic:cNvPr id="1" name=""/>
-                          <pic:cNvPicPr/>
-                        </pic:nvPicPr>
-                        <pic:blipFill>
-                          <a:blip r:embed="rId16"/>
-                          <a:stretch>
-                            <a:fillRect/>
-                          </a:stretch>
-                        </pic:blipFill>
-                        <pic:spPr>
-                          <a:xfrm>
-                            <a:off x="0" y="0"/>
-                            <a:ext cx="2743438" cy="1912786"/>
-                          </a:xfrm>
-                          <a:prstGeom prst="rect">
-                            <a:avLst/>
-                          </a:prstGeom>
-                        </pic:spPr>
-                      </pic:pic>
-                    </a:graphicData>
-                  </a:graphic>
-                </wp:inline>
-              </w:drawing>
-            </w:r>
-            <w:r>
-              <w:rPr>
-                <w:i/>
-                <w:iCs/>
-                <w:color w:val="AAB7C4"/>
-                <w:sz w:val="22"/>
-                <w:szCs w:val="22"/>
-              </w:rPr>
-              <w:t>nshot 2 tại đây]</w:t>
-            </w:r>
-          </w:p>
-          <w:p>
-            <w:pPr>
-              <w:spacing w:before="1200" w:after="80"/>
-              <w:jc w:val="center"/>
-            </w:pPr>
-            <w:r>
-              <w:rPr>
-                <w:i/>
-                <w:iCs/>
-                <w:sz w:val="22"/>
-                <w:szCs w:val="22"/>
-              </w:rPr>
-              <w:t xml:space="preserve">Hình 2: </w:t>
-            </w:r>
-            <w:r>
-              <w:rPr>
-                <w:i/>
-                <w:iCs/>
-                <w:sz w:val="22"/>
-                <w:szCs w:val="22"/>
-              </w:rPr>
-              <w:t>Khu vực Danh sách dự án mới tuyển (ProjectGrid) và khu vực Thống kê số liệu nền tảng sử dụng tái cấu trúc SectionWrapper</w:t>
+            <w:r>
+              <w:t>Hình 2: Sơ đồ luồng dữ liệu truyền Props từ App xuống Grid và Card.</w:t>
             </w:r>
           </w:p>
         </w:tc>

</xml_diff>